<commit_message>
feat: adicionar cabeçalho oficial de largura total com logo da escola e sincronizar template docx
</commit_message>
<xml_diff>
--- a/public/template_preparado.docx
+++ b/public/template_preparado.docx
@@ -582,11 +582,663 @@
 </file>
 
 <file path=word/header2.xml><?xml version="1.0" encoding="utf-8"?>
-<w:hdr xmlns:w="http://schemas.openxmlformats.org/wordprocessingml/2006/main" xmlns:mc="http://schemas.openxmlformats.org/markup-compatibility/2006" mc:Ignorable="w14 wp14 w15"/>
+<w:hdr xmlns:o="urn:schemas-microsoft-com:office:office" xmlns:r="http://schemas.openxmlformats.org/officeDocument/2006/relationships" xmlns:v="urn:schemas-microsoft-com:vml" xmlns:w="http://schemas.openxmlformats.org/wordprocessingml/2006/main" xmlns:w10="urn:schemas-microsoft-com:office:word" xmlns:wp="http://schemas.openxmlformats.org/drawingml/2006/wordprocessingDrawing" xmlns:wps="http://schemas.microsoft.com/office/word/2010/wordprocessingShape" xmlns:wpg="http://schemas.microsoft.com/office/word/2010/wordprocessingGroup" xmlns:mc="http://schemas.openxmlformats.org/markup-compatibility/2006" xmlns:wp14="http://schemas.microsoft.com/office/word/2010/wordprocessingDrawing" xmlns:w14="http://schemas.microsoft.com/office/word/2010/wordml" xmlns:w15="http://schemas.microsoft.com/office/word/2012/wordml" mc:Ignorable="w14 wp14 w15">
+  <w:p>
+    <w:pPr>
+      <w:pStyle w:val="normal1"/>
+      <w:ind w:hanging="2" w:left="2"/>
+      <w:jc w:val="center"/>
+      <w:rPr/>
+    </w:pPr>
+    <w:r>
+      <w:rPr/>
+      <w:drawing>
+        <wp:anchor behindDoc="1" distT="0" distB="0" distL="0" distR="0" simplePos="0" locked="0" layoutInCell="1" allowOverlap="1" relativeHeight="5">
+          <wp:simplePos x="0" y="0"/>
+          <wp:positionH relativeFrom="column">
+            <wp:posOffset>7962900</wp:posOffset>
+          </wp:positionH>
+          <wp:positionV relativeFrom="paragraph">
+            <wp:posOffset>179070</wp:posOffset>
+          </wp:positionV>
+          <wp:extent cx="1036320" cy="1036320"/>
+          <wp:effectExtent l="0" t="0" r="0" b="0"/>
+          <wp:wrapNone/>
+          <wp:docPr id="1" name="image2.jpg" descr="Logotipo, nome da empresa&#10;&#10;O conteúdo gerado por IA pode estar incorreto."/>
+          <wp:cNvGraphicFramePr>
+            <a:graphicFrameLocks xmlns:a="http://schemas.openxmlformats.org/drawingml/2006/main" noChangeAspect="1"/>
+          </wp:cNvGraphicFramePr>
+          <a:graphic xmlns:a="http://schemas.openxmlformats.org/drawingml/2006/main">
+            <a:graphicData uri="http://schemas.openxmlformats.org/drawingml/2006/picture">
+              <pic:pic xmlns:pic="http://schemas.openxmlformats.org/drawingml/2006/picture">
+                <pic:nvPicPr>
+                  <pic:cNvPr id="1" name="image2.jpg" descr="Logotipo, nome da empresa&#10;&#10;O conteúdo gerado por IA pode estar incorreto."/>
+                  <pic:cNvPicPr>
+                    <a:picLocks noChangeAspect="1" noChangeArrowheads="1"/>
+                  </pic:cNvPicPr>
+                </pic:nvPicPr>
+                <pic:blipFill>
+                  <a:blip r:embed="rId1"/>
+                  <a:stretch>
+                    <a:fillRect/>
+                  </a:stretch>
+                </pic:blipFill>
+                <pic:spPr bwMode="auto">
+                  <a:xfrm>
+                    <a:off x="0" y="0"/>
+                    <a:ext cx="1036320" cy="1036320"/>
+                  </a:xfrm>
+                  <a:prstGeom prst="rect">
+                    <a:avLst/>
+                  </a:prstGeom>
+                </pic:spPr>
+              </pic:pic>
+            </a:graphicData>
+          </a:graphic>
+        </wp:anchor>
+      </w:drawing>
+    </w:r>
+    <w:bookmarkStart w:id="2" w:name="_heading=h.rir7wvygz699"/>
+    <w:bookmarkStart w:id="3" w:name="_heading=h.rir7wvygz699"/>
+    <w:bookmarkEnd w:id="3"/>
+  </w:p>
+  <w:tbl>
+    <w:tblPr>
+      <w:tblStyle w:val="Table2"/>
+      <w:tblW w:w="10376" w:type="dxa"/>
+      <w:jc w:val="left"/>
+      <w:tblInd w:w="2882" w:type="dxa"/>
+      <w:tblLayout w:type="fixed"/>
+      <w:tblCellMar>
+        <w:top w:w="0" w:type="dxa"/>
+        <w:left w:w="108" w:type="dxa"/>
+        <w:bottom w:w="0" w:type="dxa"/>
+        <w:right w:w="108" w:type="dxa"/>
+      </w:tblCellMar>
+      <w:tblLook w:val="0400"/>
+    </w:tblPr>
+    <w:tblGrid>
+      <w:gridCol w:w="1191"/>
+      <w:gridCol w:w="6802"/>
+      <w:gridCol w:w="1191"/>
+      <w:gridCol w:w="1191"/>
+    </w:tblGrid>
+    <w:tr>
+      <w:trPr>
+        <w:trHeight w:val="1415" w:hRule="atLeast"/>
+      </w:trPr>
+      <w:tc>
+        <w:tcPr>
+          <w:tcW w:w="1191" w:type="dxa"/>
+          <w:tcBorders/>
+          <w:vAlign w:val="center"/>
+        </w:tcPr>
+        <w:p>
+          <w:pPr>
+            <w:pStyle w:val="normal1"/>
+            <w:spacing w:lineRule="auto" w:line="240" w:before="0" w:after="0"/>
+            <w:ind w:hanging="2" w:left="2"/>
+            <w:jc w:val="center"/>
+            <w:rPr/>
+          </w:pPr>
+          <w:r>
+            <w:rPr/>
+            <w:drawing>
+              <wp:anchor behindDoc="1" distT="0" distB="0" distL="0" distR="0" simplePos="0" locked="0" layoutInCell="1" allowOverlap="1" relativeHeight="3">
+                <wp:simplePos x="0" y="0"/>
+                <wp:positionH relativeFrom="column">
+                  <wp:posOffset>-180975</wp:posOffset>
+                </wp:positionH>
+                <wp:positionV relativeFrom="paragraph">
+                  <wp:posOffset>-252095</wp:posOffset>
+                </wp:positionV>
+                <wp:extent cx="1455420" cy="582930"/>
+                <wp:effectExtent l="0" t="0" r="0" b="0"/>
+                <wp:wrapNone/>
+                <wp:docPr id="2" name="image1.png" descr="Desenvolvimento Econômico"/>
+                <wp:cNvGraphicFramePr>
+                  <a:graphicFrameLocks xmlns:a="http://schemas.openxmlformats.org/drawingml/2006/main" noChangeAspect="1"/>
+                </wp:cNvGraphicFramePr>
+                <a:graphic xmlns:a="http://schemas.openxmlformats.org/drawingml/2006/main">
+                  <a:graphicData uri="http://schemas.openxmlformats.org/drawingml/2006/picture">
+                    <pic:pic xmlns:pic="http://schemas.openxmlformats.org/drawingml/2006/picture">
+                      <pic:nvPicPr>
+                        <pic:cNvPr id="2" name="image1.png" descr="Desenvolvimento Econômico"/>
+                        <pic:cNvPicPr>
+                          <a:picLocks noChangeAspect="1" noChangeArrowheads="1"/>
+                        </pic:cNvPicPr>
+                      </pic:nvPicPr>
+                      <pic:blipFill>
+                        <a:blip r:embed="rId2"/>
+                        <a:stretch>
+                          <a:fillRect/>
+                        </a:stretch>
+                      </pic:blipFill>
+                      <pic:spPr bwMode="auto">
+                        <a:xfrm>
+                          <a:off x="0" y="0"/>
+                          <a:ext cx="1455420" cy="582930"/>
+                        </a:xfrm>
+                        <a:prstGeom prst="rect">
+                          <a:avLst/>
+                        </a:prstGeom>
+                      </pic:spPr>
+                    </pic:pic>
+                  </a:graphicData>
+                </a:graphic>
+              </wp:anchor>
+            </w:drawing>
+          </w:r>
+        </w:p>
+        <w:p>
+          <w:pPr>
+            <w:pStyle w:val="normal1"/>
+            <w:spacing w:lineRule="auto" w:line="240" w:before="0" w:after="0"/>
+            <w:ind w:hanging="2" w:left="0"/>
+            <w:jc w:val="center"/>
+            <w:rPr/>
+          </w:pPr>
+          <w:r>
+            <w:rPr/>
+          </w:r>
+        </w:p>
+      </w:tc>
+      <w:tc>
+        <w:tcPr>
+          <w:tcW w:w="6802" w:type="dxa"/>
+          <w:tcBorders/>
+        </w:tcPr>
+        <w:p>
+          <w:pPr>
+            <w:pStyle w:val="normal1"/>
+            <w:spacing w:lineRule="auto" w:line="240" w:before="0" w:after="0"/>
+            <w:ind w:hanging="2" w:left="0"/>
+            <w:jc w:val="center"/>
+            <w:rPr>
+              <w:b/>
+              <w:bCs/>
+            </w:rPr>
+          </w:pPr>
+          <w:r>
+            <w:rPr>
+              <w:b/>
+              <w:bCs/>
+            </w:rPr>
+            <w:t>GOVERNO DO ESTADO DE SÃO PAULO</w:t>
+          </w:r>
+        </w:p>
+        <w:p>
+          <w:pPr>
+            <w:pStyle w:val="normal1"/>
+            <w:spacing w:lineRule="auto" w:line="240" w:before="0" w:after="0"/>
+            <w:ind w:hanging="2" w:left="0"/>
+            <w:jc w:val="center"/>
+            <w:rPr>
+              <w:b/>
+              <w:bCs/>
+            </w:rPr>
+          </w:pPr>
+          <w:r>
+            <w:rPr>
+              <w:b/>
+              <w:bCs/>
+            </w:rPr>
+            <w:t>Secretaria da Educação do Estado</w:t>
+          </w:r>
+        </w:p>
+        <w:p>
+          <w:pPr>
+            <w:pStyle w:val="normal1"/>
+            <w:spacing w:lineRule="auto" w:line="240" w:before="0" w:after="0"/>
+            <w:ind w:hanging="2" w:left="0"/>
+            <w:jc w:val="center"/>
+            <w:rPr>
+              <w:b/>
+              <w:bCs/>
+            </w:rPr>
+          </w:pPr>
+          <w:r>
+            <w:rPr>
+              <w:b/>
+              <w:bCs/>
+            </w:rPr>
+            <w:t>Diretoria de Ensino – Região Sorocaba</w:t>
+          </w:r>
+        </w:p>
+        <w:p>
+          <w:pPr>
+            <w:pStyle w:val="normal1"/>
+            <w:spacing w:lineRule="auto" w:line="240" w:before="0" w:after="0"/>
+            <w:ind w:hanging="2" w:left="0"/>
+            <w:jc w:val="center"/>
+            <w:rPr>
+              <w:b/>
+              <w:bCs/>
+            </w:rPr>
+          </w:pPr>
+          <w:r>
+            <w:rPr>
+              <w:b/>
+              <w:bCs/>
+            </w:rPr>
+            <w:t>{headerEscolaNome}</w:t>
+          </w:r>
+        </w:p>
+        <w:p>
+          <w:pPr>
+            <w:pStyle w:val="normal1"/>
+            <w:spacing w:lineRule="auto" w:line="240" w:before="0" w:after="0"/>
+            <w:ind w:hanging="2" w:left="0"/>
+            <w:jc w:val="center"/>
+            <w:rPr/>
+          </w:pPr>
+          <w:r>
+            <w:rPr/>
+            <w:t>UA: 10771 – CIE: 919913</w:t>
+          </w:r>
+        </w:p>
+        <w:p>
+          <w:pPr>
+            <w:pStyle w:val="normal1"/>
+            <w:spacing w:lineRule="auto" w:line="240" w:before="0" w:after="0"/>
+            <w:ind w:hanging="2" w:left="0"/>
+            <w:jc w:val="center"/>
+            <w:rPr/>
+          </w:pPr>
+          <w:r>
+            <w:rPr>
+              <w:sz w:val="20"/>
+              <w:szCs w:val="20"/>
+            </w:rPr>
+            <w:t>Estrada Dom José Melhado Campos, nº 330, Jardim Josane - Sorocaba</w:t>
+          </w:r>
+        </w:p>
+      </w:tc>
+      <w:tc>
+        <w:tcPr>
+          <w:tcW w:w="1191" w:type="dxa"/>
+          <w:tcBorders/>
+        </w:tcPr>
+        <w:p>
+          <w:pPr>
+            <w:pStyle w:val="normal1"/>
+            <w:spacing w:lineRule="auto" w:line="240" w:before="0" w:after="0"/>
+            <w:ind w:hanging="2" w:left="0"/>
+            <w:jc w:val="center"/>
+            <w:rPr/>
+          </w:pPr>
+          <w:r>
+            <w:rPr/>
+          </w:r>
+        </w:p>
+      </w:tc>
+      <w:tc>
+        <w:tcPr>
+          <w:tcW w:w="1191" w:type="dxa"/>
+          <w:tcBorders/>
+        </w:tcPr>
+        <w:p>
+          <w:pPr>
+            <w:pStyle w:val="normal1"/>
+            <w:spacing w:lineRule="auto" w:line="240" w:before="0" w:after="0"/>
+            <w:ind w:hanging="2" w:left="0"/>
+            <w:jc w:val="center"/>
+            <w:rPr/>
+          </w:pPr>
+          <w:r>
+            <w:rPr/>
+          </w:r>
+        </w:p>
+      </w:tc>
+    </w:tr>
+  </w:tbl>
+  <w:p>
+    <w:pPr>
+      <w:pStyle w:val="normal1"/>
+      <w:pBdr/>
+      <w:spacing w:lineRule="auto" w:line="240" w:before="0" w:after="0"/>
+      <w:ind w:hanging="2" w:left="0"/>
+      <w:rPr>
+        <w:color w:val="000000"/>
+      </w:rPr>
+    </w:pPr>
+    <w:r>
+      <w:rPr>
+        <w:color w:val="000000"/>
+      </w:rPr>
+    </w:r>
+  </w:p>
+</w:hdr>
 </file>
 
 <file path=word/header3.xml><?xml version="1.0" encoding="utf-8"?>
-<w:hdr xmlns:w="http://schemas.openxmlformats.org/wordprocessingml/2006/main" xmlns:mc="http://schemas.openxmlformats.org/markup-compatibility/2006" mc:Ignorable="w14 wp14 w15"/>
+<w:hdr xmlns:o="urn:schemas-microsoft-com:office:office" xmlns:r="http://schemas.openxmlformats.org/officeDocument/2006/relationships" xmlns:v="urn:schemas-microsoft-com:vml" xmlns:w="http://schemas.openxmlformats.org/wordprocessingml/2006/main" xmlns:w10="urn:schemas-microsoft-com:office:word" xmlns:wp="http://schemas.openxmlformats.org/drawingml/2006/wordprocessingDrawing" xmlns:wps="http://schemas.microsoft.com/office/word/2010/wordprocessingShape" xmlns:wpg="http://schemas.microsoft.com/office/word/2010/wordprocessingGroup" xmlns:mc="http://schemas.openxmlformats.org/markup-compatibility/2006" xmlns:wp14="http://schemas.microsoft.com/office/word/2010/wordprocessingDrawing" xmlns:w14="http://schemas.microsoft.com/office/word/2010/wordml" xmlns:w15="http://schemas.microsoft.com/office/word/2012/wordml" mc:Ignorable="w14 wp14 w15">
+  <w:p>
+    <w:pPr>
+      <w:pStyle w:val="normal1"/>
+      <w:ind w:hanging="2" w:left="2"/>
+      <w:jc w:val="center"/>
+      <w:rPr/>
+    </w:pPr>
+    <w:r>
+      <w:rPr/>
+      <w:drawing>
+        <wp:anchor behindDoc="1" distT="0" distB="0" distL="0" distR="0" simplePos="0" locked="0" layoutInCell="1" allowOverlap="1" relativeHeight="5">
+          <wp:simplePos x="0" y="0"/>
+          <wp:positionH relativeFrom="column">
+            <wp:posOffset>7962900</wp:posOffset>
+          </wp:positionH>
+          <wp:positionV relativeFrom="paragraph">
+            <wp:posOffset>179070</wp:posOffset>
+          </wp:positionV>
+          <wp:extent cx="1036320" cy="1036320"/>
+          <wp:effectExtent l="0" t="0" r="0" b="0"/>
+          <wp:wrapNone/>
+          <wp:docPr id="3" name="image2.jpg" descr="Logotipo, nome da empresa&#10;&#10;O conteúdo gerado por IA pode estar incorreto."/>
+          <wp:cNvGraphicFramePr>
+            <a:graphicFrameLocks xmlns:a="http://schemas.openxmlformats.org/drawingml/2006/main" noChangeAspect="1"/>
+          </wp:cNvGraphicFramePr>
+          <a:graphic xmlns:a="http://schemas.openxmlformats.org/drawingml/2006/main">
+            <a:graphicData uri="http://schemas.openxmlformats.org/drawingml/2006/picture">
+              <pic:pic xmlns:pic="http://schemas.openxmlformats.org/drawingml/2006/picture">
+                <pic:nvPicPr>
+                  <pic:cNvPr id="3" name="image2.jpg" descr="Logotipo, nome da empresa&#10;&#10;O conteúdo gerado por IA pode estar incorreto."/>
+                  <pic:cNvPicPr>
+                    <a:picLocks noChangeAspect="1" noChangeArrowheads="1"/>
+                  </pic:cNvPicPr>
+                </pic:nvPicPr>
+                <pic:blipFill>
+                  <a:blip r:embed="rId1"/>
+                  <a:stretch>
+                    <a:fillRect/>
+                  </a:stretch>
+                </pic:blipFill>
+                <pic:spPr bwMode="auto">
+                  <a:xfrm>
+                    <a:off x="0" y="0"/>
+                    <a:ext cx="1036320" cy="1036320"/>
+                  </a:xfrm>
+                  <a:prstGeom prst="rect">
+                    <a:avLst/>
+                  </a:prstGeom>
+                </pic:spPr>
+              </pic:pic>
+            </a:graphicData>
+          </a:graphic>
+        </wp:anchor>
+      </w:drawing>
+    </w:r>
+    <w:bookmarkStart w:id="4" w:name="_heading=h.rir7wvygz699"/>
+    <w:bookmarkStart w:id="5" w:name="_heading=h.rir7wvygz699"/>
+    <w:bookmarkEnd w:id="5"/>
+  </w:p>
+  <w:tbl>
+    <w:tblPr>
+      <w:tblStyle w:val="Table2"/>
+      <w:tblW w:w="10376" w:type="dxa"/>
+      <w:jc w:val="left"/>
+      <w:tblInd w:w="2882" w:type="dxa"/>
+      <w:tblLayout w:type="fixed"/>
+      <w:tblCellMar>
+        <w:top w:w="0" w:type="dxa"/>
+        <w:left w:w="108" w:type="dxa"/>
+        <w:bottom w:w="0" w:type="dxa"/>
+        <w:right w:w="108" w:type="dxa"/>
+      </w:tblCellMar>
+      <w:tblLook w:val="0400"/>
+    </w:tblPr>
+    <w:tblGrid>
+      <w:gridCol w:w="1191"/>
+      <w:gridCol w:w="6802"/>
+      <w:gridCol w:w="1191"/>
+      <w:gridCol w:w="1191"/>
+    </w:tblGrid>
+    <w:tr>
+      <w:trPr>
+        <w:trHeight w:val="1415" w:hRule="atLeast"/>
+      </w:trPr>
+      <w:tc>
+        <w:tcPr>
+          <w:tcW w:w="1191" w:type="dxa"/>
+          <w:tcBorders/>
+          <w:vAlign w:val="center"/>
+        </w:tcPr>
+        <w:p>
+          <w:pPr>
+            <w:pStyle w:val="normal1"/>
+            <w:spacing w:lineRule="auto" w:line="240" w:before="0" w:after="0"/>
+            <w:ind w:hanging="2" w:left="2"/>
+            <w:jc w:val="center"/>
+            <w:rPr/>
+          </w:pPr>
+          <w:r>
+            <w:rPr/>
+            <w:drawing>
+              <wp:anchor behindDoc="1" distT="0" distB="0" distL="0" distR="0" simplePos="0" locked="0" layoutInCell="1" allowOverlap="1" relativeHeight="3">
+                <wp:simplePos x="0" y="0"/>
+                <wp:positionH relativeFrom="column">
+                  <wp:posOffset>-180975</wp:posOffset>
+                </wp:positionH>
+                <wp:positionV relativeFrom="paragraph">
+                  <wp:posOffset>-252095</wp:posOffset>
+                </wp:positionV>
+                <wp:extent cx="1455420" cy="582930"/>
+                <wp:effectExtent l="0" t="0" r="0" b="0"/>
+                <wp:wrapNone/>
+                <wp:docPr id="4" name="image1.png" descr="Desenvolvimento Econômico"/>
+                <wp:cNvGraphicFramePr>
+                  <a:graphicFrameLocks xmlns:a="http://schemas.openxmlformats.org/drawingml/2006/main" noChangeAspect="1"/>
+                </wp:cNvGraphicFramePr>
+                <a:graphic xmlns:a="http://schemas.openxmlformats.org/drawingml/2006/main">
+                  <a:graphicData uri="http://schemas.openxmlformats.org/drawingml/2006/picture">
+                    <pic:pic xmlns:pic="http://schemas.openxmlformats.org/drawingml/2006/picture">
+                      <pic:nvPicPr>
+                        <pic:cNvPr id="4" name="image1.png" descr="Desenvolvimento Econômico"/>
+                        <pic:cNvPicPr>
+                          <a:picLocks noChangeAspect="1" noChangeArrowheads="1"/>
+                        </pic:cNvPicPr>
+                      </pic:nvPicPr>
+                      <pic:blipFill>
+                        <a:blip r:embed="rId2"/>
+                        <a:stretch>
+                          <a:fillRect/>
+                        </a:stretch>
+                      </pic:blipFill>
+                      <pic:spPr bwMode="auto">
+                        <a:xfrm>
+                          <a:off x="0" y="0"/>
+                          <a:ext cx="1455420" cy="582930"/>
+                        </a:xfrm>
+                        <a:prstGeom prst="rect">
+                          <a:avLst/>
+                        </a:prstGeom>
+                      </pic:spPr>
+                    </pic:pic>
+                  </a:graphicData>
+                </a:graphic>
+              </wp:anchor>
+            </w:drawing>
+          </w:r>
+        </w:p>
+        <w:p>
+          <w:pPr>
+            <w:pStyle w:val="normal1"/>
+            <w:spacing w:lineRule="auto" w:line="240" w:before="0" w:after="0"/>
+            <w:ind w:hanging="2" w:left="0"/>
+            <w:jc w:val="center"/>
+            <w:rPr/>
+          </w:pPr>
+          <w:r>
+            <w:rPr/>
+          </w:r>
+        </w:p>
+      </w:tc>
+      <w:tc>
+        <w:tcPr>
+          <w:tcW w:w="6802" w:type="dxa"/>
+          <w:tcBorders/>
+        </w:tcPr>
+        <w:p>
+          <w:pPr>
+            <w:pStyle w:val="normal1"/>
+            <w:spacing w:lineRule="auto" w:line="240" w:before="0" w:after="0"/>
+            <w:ind w:hanging="2" w:left="0"/>
+            <w:jc w:val="center"/>
+            <w:rPr>
+              <w:b/>
+              <w:bCs/>
+            </w:rPr>
+          </w:pPr>
+          <w:r>
+            <w:rPr>
+              <w:b/>
+              <w:bCs/>
+            </w:rPr>
+            <w:t>GOVERNO DO ESTADO DE SÃO PAULO</w:t>
+          </w:r>
+        </w:p>
+        <w:p>
+          <w:pPr>
+            <w:pStyle w:val="normal1"/>
+            <w:spacing w:lineRule="auto" w:line="240" w:before="0" w:after="0"/>
+            <w:ind w:hanging="2" w:left="0"/>
+            <w:jc w:val="center"/>
+            <w:rPr>
+              <w:b/>
+              <w:bCs/>
+            </w:rPr>
+          </w:pPr>
+          <w:r>
+            <w:rPr>
+              <w:b/>
+              <w:bCs/>
+            </w:rPr>
+            <w:t>Secretaria da Educação do Estado</w:t>
+          </w:r>
+        </w:p>
+        <w:p>
+          <w:pPr>
+            <w:pStyle w:val="normal1"/>
+            <w:spacing w:lineRule="auto" w:line="240" w:before="0" w:after="0"/>
+            <w:ind w:hanging="2" w:left="0"/>
+            <w:jc w:val="center"/>
+            <w:rPr>
+              <w:b/>
+              <w:bCs/>
+            </w:rPr>
+          </w:pPr>
+          <w:r>
+            <w:rPr>
+              <w:b/>
+              <w:bCs/>
+            </w:rPr>
+            <w:t>Diretoria de Ensino – Região Sorocaba</w:t>
+          </w:r>
+        </w:p>
+        <w:p>
+          <w:pPr>
+            <w:pStyle w:val="normal1"/>
+            <w:spacing w:lineRule="auto" w:line="240" w:before="0" w:after="0"/>
+            <w:ind w:hanging="2" w:left="0"/>
+            <w:jc w:val="center"/>
+            <w:rPr>
+              <w:b/>
+              <w:bCs/>
+            </w:rPr>
+          </w:pPr>
+          <w:r>
+            <w:rPr>
+              <w:b/>
+              <w:bCs/>
+            </w:rPr>
+            <w:t>{headerEscolaNome}</w:t>
+          </w:r>
+        </w:p>
+        <w:p>
+          <w:pPr>
+            <w:pStyle w:val="normal1"/>
+            <w:spacing w:lineRule="auto" w:line="240" w:before="0" w:after="0"/>
+            <w:ind w:hanging="2" w:left="0"/>
+            <w:jc w:val="center"/>
+            <w:rPr/>
+          </w:pPr>
+          <w:r>
+            <w:rPr/>
+            <w:t>UA: 10771 – CIE: 919913</w:t>
+          </w:r>
+        </w:p>
+        <w:p>
+          <w:pPr>
+            <w:pStyle w:val="normal1"/>
+            <w:spacing w:lineRule="auto" w:line="240" w:before="0" w:after="0"/>
+            <w:ind w:hanging="2" w:left="0"/>
+            <w:jc w:val="center"/>
+            <w:rPr/>
+          </w:pPr>
+          <w:r>
+            <w:rPr>
+              <w:sz w:val="20"/>
+              <w:szCs w:val="20"/>
+            </w:rPr>
+            <w:t>Estrada Dom José Melhado Campos, nº 330, Jardim Josane - Sorocaba</w:t>
+          </w:r>
+        </w:p>
+      </w:tc>
+      <w:tc>
+        <w:tcPr>
+          <w:tcW w:w="1191" w:type="dxa"/>
+          <w:tcBorders/>
+        </w:tcPr>
+        <w:p>
+          <w:pPr>
+            <w:pStyle w:val="normal1"/>
+            <w:spacing w:lineRule="auto" w:line="240" w:before="0" w:after="0"/>
+            <w:ind w:hanging="2" w:left="0"/>
+            <w:jc w:val="center"/>
+            <w:rPr/>
+          </w:pPr>
+          <w:r>
+            <w:rPr/>
+          </w:r>
+        </w:p>
+      </w:tc>
+      <w:tc>
+        <w:tcPr>
+          <w:tcW w:w="1191" w:type="dxa"/>
+          <w:tcBorders/>
+        </w:tcPr>
+        <w:p>
+          <w:pPr>
+            <w:pStyle w:val="normal1"/>
+            <w:spacing w:lineRule="auto" w:line="240" w:before="0" w:after="0"/>
+            <w:ind w:hanging="2" w:left="0"/>
+            <w:jc w:val="center"/>
+            <w:rPr/>
+          </w:pPr>
+          <w:r>
+            <w:rPr/>
+          </w:r>
+        </w:p>
+      </w:tc>
+    </w:tr>
+  </w:tbl>
+  <w:p>
+    <w:pPr>
+      <w:pStyle w:val="normal1"/>
+      <w:pBdr/>
+      <w:spacing w:lineRule="auto" w:line="240" w:before="0" w:after="0"/>
+      <w:ind w:hanging="2" w:left="0"/>
+      <w:rPr>
+        <w:color w:val="000000"/>
+      </w:rPr>
+    </w:pPr>
+    <w:r>
+      <w:rPr>
+        <w:color w:val="000000"/>
+      </w:rPr>
+    </w:r>
+  </w:p>
+</w:hdr>
 </file>
 
 <file path=word/styles.xml><?xml version="1.0" encoding="utf-8"?>

</xml_diff>